<commit_message>
Agregar capturas reales de IoT Central e incrustar una en el informe
- evidencias: device Connected + raw data, flota, JSON 3 variables, SDK Lab2 conectado, Data explorer (temperatura 24h)
- informe: figura lado a lado (log real + captura de IoT Central) manteniendo 2 paginas
</commit_message>
<xml_diff>
--- a/Informe_Laboratorio3.docx
+++ b/Informe_Laboratorio3.docx
@@ -69,7 +69,7 @@
       <w:r>
         <w:drawing>
           <wp:inline xmlns:a="http://schemas.openxmlformats.org/drawingml/2006/main" xmlns:pic="http://schemas.openxmlformats.org/drawingml/2006/picture">
-            <wp:extent cx="5508000" cy="2894034"/>
+            <wp:extent cx="5184000" cy="2723797"/>
             <wp:docPr id="1" name="Picture 1"/>
             <wp:cNvGraphicFramePr>
               <a:graphicFrameLocks noChangeAspect="1"/>
@@ -90,7 +90,7 @@
                   <pic:spPr>
                     <a:xfrm>
                       <a:off x="0" y="0"/>
-                      <a:ext cx="5508000" cy="2894034"/>
+                      <a:ext cx="5184000" cy="2723797"/>
                     </a:xfrm>
                     <a:prstGeom prst="rect"/>
                   </pic:spPr>
@@ -126,42 +126,107 @@
         <w:t>En la misma VM de Azure corre un segundo dispositivo (mqtt-explicito-lab3) que NO usa azure-iot-device: genera el SAS a mano, hace el registro DPS por MQTT, se conecta al IoT Hub por MQTT/TLS y publica las 3 variables. El publish 'a mano' aparece en la misma app del Lab 1. El SDK (2c5qb72vl4u) y el ESP32 de Wokwi (ve8okslkz9) siguen conectados en paralelo sobre la misma plantilla.</w:t>
       </w:r>
     </w:p>
-    <w:p>
-      <w:r>
-        <w:drawing>
-          <wp:inline xmlns:a="http://schemas.openxmlformats.org/drawingml/2006/main" xmlns:pic="http://schemas.openxmlformats.org/drawingml/2006/picture">
-            <wp:extent cx="3671999" cy="2904491"/>
-            <wp:docPr id="2" name="Picture 2"/>
-            <wp:cNvGraphicFramePr>
-              <a:graphicFrameLocks noChangeAspect="1"/>
-            </wp:cNvGraphicFramePr>
-            <a:graphic>
-              <a:graphicData uri="http://schemas.openxmlformats.org/drawingml/2006/picture">
-                <pic:pic>
-                  <pic:nvPicPr>
-                    <pic:cNvPr id="0" name="01-mqtt-explicito-connect-publish.png"/>
-                    <pic:cNvPicPr/>
-                  </pic:nvPicPr>
-                  <pic:blipFill>
-                    <a:blip r:embed="rId10"/>
-                    <a:stretch>
-                      <a:fillRect/>
-                    </a:stretch>
-                  </pic:blipFill>
-                  <pic:spPr>
-                    <a:xfrm>
-                      <a:off x="0" y="0"/>
-                      <a:ext cx="3671999" cy="2904491"/>
-                    </a:xfrm>
-                    <a:prstGeom prst="rect"/>
-                  </pic:spPr>
-                </pic:pic>
-              </a:graphicData>
-            </a:graphic>
-          </wp:inline>
-        </w:drawing>
-      </w:r>
-    </w:p>
+    <w:tbl>
+      <w:tblPr>
+        <w:tblW w:type="auto" w:w="0"/>
+        <w:jc w:val="center"/>
+        <w:tblLook w:firstColumn="1" w:firstRow="1" w:lastColumn="0" w:lastRow="0" w:noHBand="0" w:noVBand="1" w:val="04A0"/>
+      </w:tblPr>
+      <w:tblGrid>
+        <w:gridCol w:w="5046"/>
+        <w:gridCol w:w="5046"/>
+      </w:tblGrid>
+      <w:tr>
+        <w:tc>
+          <w:tcPr>
+            <w:tcW w:type="dxa" w:w="5046"/>
+          </w:tcPr>
+          <w:p>
+            <w:pPr>
+              <w:jc w:val="center"/>
+            </w:pPr>
+            <w:r>
+              <w:drawing>
+                <wp:inline xmlns:a="http://schemas.openxmlformats.org/drawingml/2006/main" xmlns:pic="http://schemas.openxmlformats.org/drawingml/2006/picture">
+                  <wp:extent cx="3096000" cy="2448885"/>
+                  <wp:docPr id="2" name="Picture 2"/>
+                  <wp:cNvGraphicFramePr>
+                    <a:graphicFrameLocks noChangeAspect="1"/>
+                  </wp:cNvGraphicFramePr>
+                  <a:graphic>
+                    <a:graphicData uri="http://schemas.openxmlformats.org/drawingml/2006/picture">
+                      <pic:pic>
+                        <pic:nvPicPr>
+                          <pic:cNvPr id="0" name="01-mqtt-explicito-connect-publish.png"/>
+                          <pic:cNvPicPr/>
+                        </pic:nvPicPr>
+                        <pic:blipFill>
+                          <a:blip r:embed="rId10"/>
+                          <a:stretch>
+                            <a:fillRect/>
+                          </a:stretch>
+                        </pic:blipFill>
+                        <pic:spPr>
+                          <a:xfrm>
+                            <a:off x="0" y="0"/>
+                            <a:ext cx="3096000" cy="2448885"/>
+                          </a:xfrm>
+                          <a:prstGeom prst="rect"/>
+                        </pic:spPr>
+                      </pic:pic>
+                    </a:graphicData>
+                  </a:graphic>
+                </wp:inline>
+              </w:drawing>
+            </w:r>
+          </w:p>
+        </w:tc>
+        <w:tc>
+          <w:tcPr>
+            <w:tcW w:type="dxa" w:w="5046"/>
+          </w:tcPr>
+          <w:p>
+            <w:pPr>
+              <w:jc w:val="center"/>
+            </w:pPr>
+            <w:r>
+              <w:drawing>
+                <wp:inline xmlns:a="http://schemas.openxmlformats.org/drawingml/2006/main" xmlns:pic="http://schemas.openxmlformats.org/drawingml/2006/picture">
+                  <wp:extent cx="2664000" cy="2537744"/>
+                  <wp:docPr id="3" name="Picture 3"/>
+                  <wp:cNvGraphicFramePr>
+                    <a:graphicFrameLocks noChangeAspect="1"/>
+                  </wp:cNvGraphicFramePr>
+                  <a:graphic>
+                    <a:graphicData uri="http://schemas.openxmlformats.org/drawingml/2006/picture">
+                      <pic:pic>
+                        <pic:nvPicPr>
+                          <pic:cNvPr id="0" name="13-device-json-3variables.png"/>
+                          <pic:cNvPicPr/>
+                        </pic:nvPicPr>
+                        <pic:blipFill>
+                          <a:blip r:embed="rId11"/>
+                          <a:stretch>
+                            <a:fillRect/>
+                          </a:stretch>
+                        </pic:blipFill>
+                        <pic:spPr>
+                          <a:xfrm>
+                            <a:off x="0" y="0"/>
+                            <a:ext cx="2664000" cy="2537744"/>
+                          </a:xfrm>
+                          <a:prstGeom prst="rect"/>
+                        </pic:spPr>
+                      </pic:pic>
+                    </a:graphicData>
+                  </a:graphic>
+                </wp:inline>
+              </w:drawing>
+            </w:r>
+          </w:p>
+        </w:tc>
+      </w:tr>
+    </w:tbl>
     <w:p>
       <w:pPr>
         <w:jc w:val="center"/>
@@ -172,7 +237,7 @@
           <w:color w:val="64748B"/>
           <w:sz w:val="16"/>
         </w:rPr>
-        <w:t>Fig. 1 — DPS por MQTT + SAS + CONNACK + publish QoS 1 con PUBACK (log real en la VM de Azure)</w:t>
+        <w:t>Fig. 1 — (izq.) log real: DPS por MQTT + SAS + publish QoS 1 con PUBACK.  (der.) el mismo publish visible en IoT Central: device Conectado y JSON con las 3 variables mapeadas.</w:t>
       </w:r>
     </w:p>
     <w:p>

</xml_diff>

<commit_message>
Informe completo: 3 paginas con todas las capturas (flujo, MQTT visible en Central, flota, Data explorer, SDK, corte, QoS2) + tablas y conclusion
</commit_message>
<xml_diff>
--- a/Informe_Laboratorio3.docx
+++ b/Informe_Laboratorio3.docx
@@ -10,32 +10,32 @@
         <w:rPr>
           <w:b/>
           <w:color w:val="1E293B"/>
-          <w:sz w:val="36"/>
+          <w:sz w:val="34"/>
         </w:rPr>
         <w:t>Laboratorio 3 — MQTT hacia Azure IoT Central</w:t>
       </w:r>
     </w:p>
     <w:p>
       <w:pPr>
-        <w:spacing w:after="40"/>
+        <w:spacing w:after="20"/>
       </w:pPr>
       <w:r>
         <w:rPr>
           <w:i/>
           <w:color w:val="1D4ED8"/>
-          <w:sz w:val="24"/>
+          <w:sz w:val="23"/>
         </w:rPr>
         <w:t>Protocolo visible, mediciones y comparación con el SDK</w:t>
       </w:r>
     </w:p>
     <w:p>
       <w:pPr>
-        <w:spacing w:after="120"/>
+        <w:spacing w:after="80"/>
       </w:pPr>
       <w:r>
         <w:rPr>
           <w:color w:val="64748B"/>
-          <w:sz w:val="18"/>
+          <w:sz w:val="17"/>
         </w:rPr>
         <w:t>IoT + Cloud + Sistemas Distribuidos · UNAB · Escenario UNAB-Ambiental · App IoT Central: medidordeclima2026</w:t>
       </w:r>
@@ -48,28 +48,32 @@
         <w:rPr>
           <w:b/>
           <w:color w:val="1D4ED8"/>
-          <w:sz w:val="25"/>
+          <w:sz w:val="23"/>
         </w:rPr>
-        <w:t>1. El protocolo real: MQTT/TLS → DPS → IoT Hub</w:t>
+        <w:t>1. El protocolo real: MQTT/TLS → DPS → IoT Hub (Etapa 1)</w:t>
       </w:r>
     </w:p>
     <w:p>
       <w:pPr>
-        <w:spacing w:after="40"/>
+        <w:spacing w:after="40" w:before="0"/>
       </w:pPr>
       <w:r>
         <w:rPr>
           <w:color w:val="1E293B"/>
-          <w:sz w:val="19"/>
+          <w:sz w:val="18"/>
         </w:rPr>
-        <w:t>Los dispositivos del Lab 2 no hablan un protocolo propietario: usan MQTT sobre TLS (puerto 8883). El primer salto es el Device Provisioning Service (DPS), que registra al dispositivo y le devuelve el IoT Hub asignado; a partir de ahí la telemetría se publica al topic devices/{deviceId}/messages/events/ autenticando con un token SAS (HMAC-SHA256 de la clave del dispositivo). Se verificó abriendo el Data explorer de IoT Central: el JSON recibido coincide con la plantilla Hobo MX-100 v3 (temperature, humedad, illuminance).</w:t>
+        <w:t>Los dispositivos del Lab 2 usan MQTT sobre TLS (puerto 8883). El primer salto es el Device Provisioning Service (DPS), que registra al dispositivo y devuelve el IoT Hub asignado; luego la telemetría se publica al topic devices/{deviceId}/messages/events/ autenticando con un token SAS (HMAC-SHA256 de la clave). Se confirmó en el Data explorer que el JSON coincide con la plantilla Hobo MX-100 v3 (temperature, humedad, illuminance).</w:t>
       </w:r>
     </w:p>
     <w:p>
+      <w:pPr>
+        <w:spacing w:before="20" w:after="0"/>
+        <w:jc w:val="center"/>
+      </w:pPr>
       <w:r>
         <w:drawing>
           <wp:inline xmlns:a="http://schemas.openxmlformats.org/drawingml/2006/main" xmlns:pic="http://schemas.openxmlformats.org/drawingml/2006/picture">
-            <wp:extent cx="5184000" cy="2723797"/>
+            <wp:extent cx="5616000" cy="2950780"/>
             <wp:docPr id="1" name="Picture 1"/>
             <wp:cNvGraphicFramePr>
               <a:graphicFrameLocks noChangeAspect="1"/>
@@ -90,7 +94,7 @@
                   <pic:spPr>
                     <a:xfrm>
                       <a:off x="0" y="0"/>
-                      <a:ext cx="5184000" cy="2723797"/>
+                      <a:ext cx="5616000" cy="2950780"/>
                     </a:xfrm>
                     <a:prstGeom prst="rect"/>
                   </pic:spPr>
@@ -109,21 +113,21 @@
         <w:rPr>
           <w:b/>
           <w:color w:val="1D4ED8"/>
-          <w:sz w:val="25"/>
+          <w:sz w:val="23"/>
         </w:rPr>
-        <w:t>2. Camino B — cliente MQTT explícito (paho-mqtt) en la VM</w:t>
+        <w:t>2. Camino B — cliente MQTT explícito (paho-mqtt) en la VM  ·  publish 'a mano' visible en Central</w:t>
       </w:r>
     </w:p>
     <w:p>
       <w:pPr>
-        <w:spacing w:after="40"/>
+        <w:spacing w:after="40" w:before="0"/>
       </w:pPr>
       <w:r>
         <w:rPr>
           <w:color w:val="1E293B"/>
-          <w:sz w:val="19"/>
+          <w:sz w:val="18"/>
         </w:rPr>
-        <w:t>En la misma VM de Azure corre un segundo dispositivo (mqtt-explicito-lab3) que NO usa azure-iot-device: genera el SAS a mano, hace el registro DPS por MQTT, se conecta al IoT Hub por MQTT/TLS y publica las 3 variables. El publish 'a mano' aparece en la misma app del Lab 1. El SDK (2c5qb72vl4u) y el ESP32 de Wokwi (ve8okslkz9) siguen conectados en paralelo sobre la misma plantilla.</w:t>
+        <w:t>En la misma VM de Azure corre un segundo dispositivo (mqtt-explicito-lab3) que NO usa azure-iot-device: genera el SAS a mano, hace el registro DPS por MQTT, se conecta al IoT Hub por MQTT/TLS y publica las 3 variables. El publish aparece en la misma aplicación del Lab 1, con las 3 variables mapeadas a la plantilla.</w:t>
       </w:r>
     </w:p>
     <w:tbl>
@@ -133,13 +137,13 @@
         <w:tblLook w:firstColumn="1" w:firstRow="1" w:lastColumn="0" w:lastRow="0" w:noHBand="0" w:noVBand="1" w:val="04A0"/>
       </w:tblPr>
       <w:tblGrid>
-        <w:gridCol w:w="5046"/>
-        <w:gridCol w:w="5046"/>
+        <w:gridCol w:w="5159"/>
+        <w:gridCol w:w="5159"/>
       </w:tblGrid>
       <w:tr>
         <w:tc>
           <w:tcPr>
-            <w:tcW w:type="dxa" w:w="5046"/>
+            <w:tcW w:type="dxa" w:w="5159"/>
           </w:tcPr>
           <w:p>
             <w:pPr>
@@ -148,7 +152,7 @@
             <w:r>
               <w:drawing>
                 <wp:inline xmlns:a="http://schemas.openxmlformats.org/drawingml/2006/main" xmlns:pic="http://schemas.openxmlformats.org/drawingml/2006/picture">
-                  <wp:extent cx="3096000" cy="2448885"/>
+                  <wp:extent cx="3131999" cy="2477360"/>
                   <wp:docPr id="2" name="Picture 2"/>
                   <wp:cNvGraphicFramePr>
                     <a:graphicFrameLocks noChangeAspect="1"/>
@@ -169,7 +173,7 @@
                         <pic:spPr>
                           <a:xfrm>
                             <a:off x="0" y="0"/>
-                            <a:ext cx="3096000" cy="2448885"/>
+                            <a:ext cx="3131999" cy="2477360"/>
                           </a:xfrm>
                           <a:prstGeom prst="rect"/>
                         </pic:spPr>
@@ -183,7 +187,7 @@
         </w:tc>
         <w:tc>
           <w:tcPr>
-            <w:tcW w:type="dxa" w:w="5046"/>
+            <w:tcW w:type="dxa" w:w="5159"/>
           </w:tcPr>
           <w:p>
             <w:pPr>
@@ -192,7 +196,7 @@
             <w:r>
               <w:drawing>
                 <wp:inline xmlns:a="http://schemas.openxmlformats.org/drawingml/2006/main" xmlns:pic="http://schemas.openxmlformats.org/drawingml/2006/picture">
-                  <wp:extent cx="2664000" cy="2537744"/>
+                  <wp:extent cx="2700000" cy="2572038"/>
                   <wp:docPr id="3" name="Picture 3"/>
                   <wp:cNvGraphicFramePr>
                     <a:graphicFrameLocks noChangeAspect="1"/>
@@ -213,7 +217,7 @@
                         <pic:spPr>
                           <a:xfrm>
                             <a:off x="0" y="0"/>
-                            <a:ext cx="2664000" cy="2537744"/>
+                            <a:ext cx="2700000" cy="2572038"/>
                           </a:xfrm>
                           <a:prstGeom prst="rect"/>
                         </pic:spPr>
@@ -229,15 +233,16 @@
     </w:tbl>
     <w:p>
       <w:pPr>
+        <w:spacing w:before="20" w:after="60"/>
         <w:jc w:val="center"/>
       </w:pPr>
       <w:r>
         <w:rPr>
           <w:i/>
           <w:color w:val="64748B"/>
-          <w:sz w:val="16"/>
+          <w:sz w:val="15"/>
         </w:rPr>
-        <w:t>Fig. 1 — (izq.) log real: DPS por MQTT + SAS + publish QoS 1 con PUBACK.  (der.) el mismo publish visible en IoT Central: device Conectado y JSON con las 3 variables mapeadas.</w:t>
+        <w:t>Fig. 1 — (izq.) log real en la VM: DPS por MQTT + SAS + CONNACK + publish QoS 1 con PUBACK.  (der.) el mismo publish visible en IoT Central: device Conectado y JSON con temperature/humedad/illuminance.</w:t>
       </w:r>
     </w:p>
     <w:p>
@@ -248,9 +253,203 @@
         <w:rPr>
           <w:b/>
           <w:color w:val="1D4ED8"/>
-          <w:sz w:val="25"/>
+          <w:sz w:val="23"/>
         </w:rPr>
-        <w:t>3. Mediciones sobre IoT Central</w:t>
+        <w:t>3. Wokwi y SDK del Lab 2 siguen visibles en la misma app</w:t>
+      </w:r>
+    </w:p>
+    <w:p>
+      <w:pPr>
+        <w:spacing w:after="40" w:before="0"/>
+      </w:pPr>
+      <w:r>
+        <w:rPr>
+          <w:color w:val="1E293B"/>
+          <w:sz w:val="18"/>
+        </w:rPr>
+        <w:t>Los tres dispositivos de código reportan a la misma app sobre la plantilla Hobo MX-100 v3: el SDK (2c5qb72vl4u), el MQTT explícito (mqtt-explicito-lab3) y el ESP32 de Wokwi (ve8okslkz9), junto a 6 simulados.</w:t>
+      </w:r>
+    </w:p>
+    <w:tbl>
+      <w:tblPr>
+        <w:tblW w:type="auto" w:w="0"/>
+        <w:jc w:val="center"/>
+        <w:tblLook w:firstColumn="1" w:firstRow="1" w:lastColumn="0" w:lastRow="0" w:noHBand="0" w:noVBand="1" w:val="04A0"/>
+      </w:tblPr>
+      <w:tblGrid>
+        <w:gridCol w:w="5159"/>
+        <w:gridCol w:w="5159"/>
+      </w:tblGrid>
+      <w:tr>
+        <w:tc>
+          <w:tcPr>
+            <w:tcW w:type="dxa" w:w="5159"/>
+          </w:tcPr>
+          <w:p>
+            <w:pPr>
+              <w:jc w:val="center"/>
+            </w:pPr>
+            <w:r>
+              <w:drawing>
+                <wp:inline xmlns:a="http://schemas.openxmlformats.org/drawingml/2006/main" xmlns:pic="http://schemas.openxmlformats.org/drawingml/2006/picture">
+                  <wp:extent cx="3096000" cy="2949270"/>
+                  <wp:docPr id="4" name="Picture 4"/>
+                  <wp:cNvGraphicFramePr>
+                    <a:graphicFrameLocks noChangeAspect="1"/>
+                  </wp:cNvGraphicFramePr>
+                  <a:graphic>
+                    <a:graphicData uri="http://schemas.openxmlformats.org/drawingml/2006/picture">
+                      <pic:pic>
+                        <pic:nvPicPr>
+                          <pic:cNvPr id="0" name="12-flota-iotcentral.png"/>
+                          <pic:cNvPicPr/>
+                        </pic:nvPicPr>
+                        <pic:blipFill>
+                          <a:blip r:embed="rId12"/>
+                          <a:stretch>
+                            <a:fillRect/>
+                          </a:stretch>
+                        </pic:blipFill>
+                        <pic:spPr>
+                          <a:xfrm>
+                            <a:off x="0" y="0"/>
+                            <a:ext cx="3096000" cy="2949270"/>
+                          </a:xfrm>
+                          <a:prstGeom prst="rect"/>
+                        </pic:spPr>
+                      </pic:pic>
+                    </a:graphicData>
+                  </a:graphic>
+                </wp:inline>
+              </w:drawing>
+            </w:r>
+          </w:p>
+        </w:tc>
+        <w:tc>
+          <w:tcPr>
+            <w:tcW w:type="dxa" w:w="5159"/>
+          </w:tcPr>
+          <w:p>
+            <w:pPr>
+              <w:jc w:val="center"/>
+            </w:pPr>
+            <w:r>
+              <w:drawing>
+                <wp:inline xmlns:a="http://schemas.openxmlformats.org/drawingml/2006/main" xmlns:pic="http://schemas.openxmlformats.org/drawingml/2006/picture">
+                  <wp:extent cx="3096000" cy="2949270"/>
+                  <wp:docPr id="5" name="Picture 5"/>
+                  <wp:cNvGraphicFramePr>
+                    <a:graphicFrameLocks noChangeAspect="1"/>
+                  </wp:cNvGraphicFramePr>
+                  <a:graphic>
+                    <a:graphicData uri="http://schemas.openxmlformats.org/drawingml/2006/picture">
+                      <pic:pic>
+                        <pic:nvPicPr>
+                          <pic:cNvPr id="0" name="14-sdk-lab2-connected.png"/>
+                          <pic:cNvPicPr/>
+                        </pic:nvPicPr>
+                        <pic:blipFill>
+                          <a:blip r:embed="rId13"/>
+                          <a:stretch>
+                            <a:fillRect/>
+                          </a:stretch>
+                        </pic:blipFill>
+                        <pic:spPr>
+                          <a:xfrm>
+                            <a:off x="0" y="0"/>
+                            <a:ext cx="3096000" cy="2949270"/>
+                          </a:xfrm>
+                          <a:prstGeom prst="rect"/>
+                        </pic:spPr>
+                      </pic:pic>
+                    </a:graphicData>
+                  </a:graphic>
+                </wp:inline>
+              </w:drawing>
+            </w:r>
+          </w:p>
+        </w:tc>
+      </w:tr>
+    </w:tbl>
+    <w:p>
+      <w:pPr>
+        <w:spacing w:before="20" w:after="60"/>
+        <w:jc w:val="center"/>
+      </w:pPr>
+      <w:r>
+        <w:rPr>
+          <w:i/>
+          <w:color w:val="64748B"/>
+          <w:sz w:val="15"/>
+        </w:rPr>
+        <w:t>Fig. 2 — (izq.) la flota completa sobre la plantilla.  (der.) el dispositivo SDK del Lab 2 sigue Conectado y enviando.</w:t>
+      </w:r>
+    </w:p>
+    <w:p>
+      <w:pPr>
+        <w:spacing w:before="20" w:after="0"/>
+        <w:jc w:val="center"/>
+      </w:pPr>
+      <w:r>
+        <w:drawing>
+          <wp:inline xmlns:a="http://schemas.openxmlformats.org/drawingml/2006/main" xmlns:pic="http://schemas.openxmlformats.org/drawingml/2006/picture">
+            <wp:extent cx="4464000" cy="4252436"/>
+            <wp:docPr id="6" name="Picture 6"/>
+            <wp:cNvGraphicFramePr>
+              <a:graphicFrameLocks noChangeAspect="1"/>
+            </wp:cNvGraphicFramePr>
+            <a:graphic>
+              <a:graphicData uri="http://schemas.openxmlformats.org/drawingml/2006/picture">
+                <pic:pic>
+                  <pic:nvPicPr>
+                    <pic:cNvPr id="0" name="15-data-explorer-temperatura.png"/>
+                    <pic:cNvPicPr/>
+                  </pic:nvPicPr>
+                  <pic:blipFill>
+                    <a:blip r:embed="rId14"/>
+                    <a:stretch>
+                      <a:fillRect/>
+                    </a:stretch>
+                  </pic:blipFill>
+                  <pic:spPr>
+                    <a:xfrm>
+                      <a:off x="0" y="0"/>
+                      <a:ext cx="4464000" cy="4252436"/>
+                    </a:xfrm>
+                    <a:prstGeom prst="rect"/>
+                  </pic:spPr>
+                </pic:pic>
+              </a:graphicData>
+            </a:graphic>
+          </wp:inline>
+        </w:drawing>
+      </w:r>
+    </w:p>
+    <w:p>
+      <w:pPr>
+        <w:spacing w:before="20" w:after="60"/>
+        <w:jc w:val="center"/>
+      </w:pPr>
+      <w:r>
+        <w:rPr>
+          <w:i/>
+          <w:color w:val="64748B"/>
+          <w:sz w:val="15"/>
+        </w:rPr>
+        <w:t>Fig. 3 — Data explorer: tendencia de temperatura de la flota (últimas 24 h).</w:t>
+      </w:r>
+    </w:p>
+    <w:p>
+      <w:pPr>
+        <w:spacing w:before="100" w:after="40"/>
+      </w:pPr>
+      <w:r>
+        <w:rPr>
+          <w:b/>
+          <w:color w:val="1D4ED8"/>
+          <w:sz w:val="23"/>
+        </w:rPr>
+        <w:t>4. Mediciones sobre IoT Central (Etapa 3)</w:t>
       </w:r>
     </w:p>
     <w:tbl>
@@ -261,20 +460,20 @@
         <w:tblLook w:firstColumn="1" w:firstRow="1" w:lastColumn="0" w:lastRow="0" w:noHBand="0" w:noVBand="1" w:val="04A0"/>
       </w:tblPr>
       <w:tblGrid>
-        <w:gridCol w:w="2523"/>
-        <w:gridCol w:w="2523"/>
-        <w:gridCol w:w="2523"/>
-        <w:gridCol w:w="2523"/>
+        <w:gridCol w:w="2579"/>
+        <w:gridCol w:w="2579"/>
+        <w:gridCol w:w="2579"/>
+        <w:gridCol w:w="2579"/>
       </w:tblGrid>
       <w:tr>
         <w:tc>
           <w:tcPr>
-            <w:tcW w:type="dxa" w:w="2098"/>
+            <w:tcW w:type="dxa" w:w="2211"/>
             <w:shd w:val="clear" w:fill="1D4ED8"/>
           </w:tcPr>
           <w:p>
             <w:pPr>
-              <w:spacing w:after="20" w:before="20"/>
+              <w:spacing w:after="0" w:before="0"/>
               <w:jc w:val="center"/>
             </w:pPr>
             <w:r/>
@@ -282,7 +481,7 @@
               <w:rPr>
                 <w:b/>
                 <w:color w:val="FFFFFF"/>
-                <w:sz w:val="19"/>
+                <w:sz w:val="17"/>
               </w:rPr>
               <w:t>Métrica</w:t>
             </w:r>
@@ -290,12 +489,12 @@
         </w:tc>
         <w:tc>
           <w:tcPr>
-            <w:tcW w:type="dxa" w:w="2438"/>
+            <w:tcW w:type="dxa" w:w="2381"/>
             <w:shd w:val="clear" w:fill="1D4ED8"/>
           </w:tcPr>
           <w:p>
             <w:pPr>
-              <w:spacing w:after="20" w:before="20"/>
+              <w:spacing w:after="0" w:before="0"/>
               <w:jc w:val="center"/>
             </w:pPr>
             <w:r/>
@@ -303,7 +502,7 @@
               <w:rPr>
                 <w:b/>
                 <w:color w:val="FFFFFF"/>
-                <w:sz w:val="19"/>
+                <w:sz w:val="17"/>
               </w:rPr>
               <w:t>SDK (azure-iot-device)</w:t>
             </w:r>
@@ -311,12 +510,12 @@
         </w:tc>
         <w:tc>
           <w:tcPr>
-            <w:tcW w:type="dxa" w:w="2948"/>
+            <w:tcW w:type="dxa" w:w="3005"/>
             <w:shd w:val="clear" w:fill="1D4ED8"/>
           </w:tcPr>
           <w:p>
             <w:pPr>
-              <w:spacing w:after="20" w:before="20"/>
+              <w:spacing w:after="0" w:before="0"/>
               <w:jc w:val="center"/>
             </w:pPr>
             <w:r/>
@@ -324,7 +523,7 @@
               <w:rPr>
                 <w:b/>
                 <w:color w:val="FFFFFF"/>
-                <w:sz w:val="19"/>
+                <w:sz w:val="17"/>
               </w:rPr>
               <w:t>MQTT explícito (paho)</w:t>
             </w:r>
@@ -337,7 +536,7 @@
           </w:tcPr>
           <w:p>
             <w:pPr>
-              <w:spacing w:after="20" w:before="20"/>
+              <w:spacing w:after="0" w:before="0"/>
               <w:jc w:val="center"/>
             </w:pPr>
             <w:r/>
@@ -345,7 +544,7 @@
               <w:rPr>
                 <w:b/>
                 <w:color w:val="FFFFFF"/>
-                <w:sz w:val="19"/>
+                <w:sz w:val="17"/>
               </w:rPr>
               <w:t>ESP32 Wokwi (Arduino)</w:t>
             </w:r>
@@ -355,17 +554,17 @@
       <w:tr>
         <w:tc>
           <w:tcPr>
-            <w:tcW w:type="dxa" w:w="2098"/>
+            <w:tcW w:type="dxa" w:w="2211"/>
           </w:tcPr>
           <w:p>
             <w:pPr>
-              <w:spacing w:after="20" w:before="20"/>
+              <w:spacing w:after="0" w:before="0"/>
             </w:pPr>
             <w:r/>
             <w:r>
               <w:rPr>
                 <w:b/>
-                <w:sz w:val="18"/>
+                <w:sz w:val="16"/>
               </w:rPr>
               <w:t>Payload JSON</w:t>
             </w:r>
@@ -373,17 +572,17 @@
         </w:tc>
         <w:tc>
           <w:tcPr>
-            <w:tcW w:type="dxa" w:w="2438"/>
+            <w:tcW w:type="dxa" w:w="2381"/>
           </w:tcPr>
           <w:p>
             <w:pPr>
-              <w:spacing w:after="20" w:before="20"/>
+              <w:spacing w:after="0" w:before="0"/>
             </w:pPr>
             <w:r/>
             <w:r>
               <w:rPr>
                 <w:b w:val="0"/>
-                <w:sz w:val="18"/>
+                <w:sz w:val="16"/>
               </w:rPr>
               <w:t>58 B (con espacios)</w:t>
             </w:r>
@@ -391,17 +590,17 @@
         </w:tc>
         <w:tc>
           <w:tcPr>
-            <w:tcW w:type="dxa" w:w="2948"/>
+            <w:tcW w:type="dxa" w:w="3005"/>
           </w:tcPr>
           <w:p>
             <w:pPr>
-              <w:spacing w:after="20" w:before="20"/>
+              <w:spacing w:after="0" w:before="0"/>
             </w:pPr>
             <w:r/>
             <w:r>
               <w:rPr>
                 <w:b w:val="0"/>
-                <w:sz w:val="18"/>
+                <w:sz w:val="16"/>
               </w:rPr>
               <w:t>53 B (compacto)</w:t>
             </w:r>
@@ -413,13 +612,13 @@
           </w:tcPr>
           <w:p>
             <w:pPr>
-              <w:spacing w:after="20" w:before="20"/>
+              <w:spacing w:after="0" w:before="0"/>
             </w:pPr>
             <w:r/>
             <w:r>
               <w:rPr>
                 <w:b w:val="0"/>
-                <w:sz w:val="18"/>
+                <w:sz w:val="16"/>
               </w:rPr>
               <w:t>~55 B</w:t>
             </w:r>
@@ -429,18 +628,18 @@
       <w:tr>
         <w:tc>
           <w:tcPr>
-            <w:tcW w:type="dxa" w:w="2098"/>
+            <w:tcW w:type="dxa" w:w="2211"/>
             <w:shd w:val="clear" w:fill="EEF2FF"/>
           </w:tcPr>
           <w:p>
             <w:pPr>
-              <w:spacing w:after="20" w:before="20"/>
+              <w:spacing w:after="0" w:before="0"/>
             </w:pPr>
             <w:r/>
             <w:r>
               <w:rPr>
                 <w:b/>
-                <w:sz w:val="18"/>
+                <w:sz w:val="16"/>
               </w:rPr>
               <w:t>Intervalo config. → observado</w:t>
             </w:r>
@@ -448,18 +647,18 @@
         </w:tc>
         <w:tc>
           <w:tcPr>
-            <w:tcW w:type="dxa" w:w="2438"/>
+            <w:tcW w:type="dxa" w:w="2381"/>
             <w:shd w:val="clear" w:fill="EEF2FF"/>
           </w:tcPr>
           <w:p>
             <w:pPr>
-              <w:spacing w:after="20" w:before="20"/>
+              <w:spacing w:after="0" w:before="0"/>
             </w:pPr>
             <w:r/>
             <w:r>
               <w:rPr>
                 <w:b w:val="0"/>
-                <w:sz w:val="18"/>
+                <w:sz w:val="16"/>
               </w:rPr>
               <w:t>5 s → ~5 s</w:t>
             </w:r>
@@ -467,18 +666,18 @@
         </w:tc>
         <w:tc>
           <w:tcPr>
-            <w:tcW w:type="dxa" w:w="2948"/>
+            <w:tcW w:type="dxa" w:w="3005"/>
             <w:shd w:val="clear" w:fill="EEF2FF"/>
           </w:tcPr>
           <w:p>
             <w:pPr>
-              <w:spacing w:after="20" w:before="20"/>
+              <w:spacing w:after="0" w:before="0"/>
             </w:pPr>
             <w:r/>
             <w:r>
               <w:rPr>
                 <w:b w:val="0"/>
-                <w:sz w:val="18"/>
+                <w:sz w:val="16"/>
               </w:rPr>
               <w:t>5 s → ~5 s</w:t>
             </w:r>
@@ -491,13 +690,13 @@
           </w:tcPr>
           <w:p>
             <w:pPr>
-              <w:spacing w:after="20" w:before="20"/>
+              <w:spacing w:after="0" w:before="0"/>
             </w:pPr>
             <w:r/>
             <w:r>
               <w:rPr>
                 <w:b w:val="0"/>
-                <w:sz w:val="18"/>
+                <w:sz w:val="16"/>
               </w:rPr>
               <w:t>~5 s</w:t>
             </w:r>
@@ -507,17 +706,17 @@
       <w:tr>
         <w:tc>
           <w:tcPr>
-            <w:tcW w:type="dxa" w:w="2098"/>
+            <w:tcW w:type="dxa" w:w="2211"/>
           </w:tcPr>
           <w:p>
             <w:pPr>
-              <w:spacing w:after="20" w:before="20"/>
+              <w:spacing w:after="0" w:before="0"/>
             </w:pPr>
             <w:r/>
             <w:r>
               <w:rPr>
                 <w:b/>
-                <w:sz w:val="18"/>
+                <w:sz w:val="16"/>
               </w:rPr>
               <w:t>Latencia publish→PUBACK</w:t>
             </w:r>
@@ -525,17 +724,17 @@
         </w:tc>
         <w:tc>
           <w:tcPr>
-            <w:tcW w:type="dxa" w:w="2438"/>
+            <w:tcW w:type="dxa" w:w="2381"/>
           </w:tcPr>
           <w:p>
             <w:pPr>
-              <w:spacing w:after="20" w:before="20"/>
+              <w:spacing w:after="0" w:before="0"/>
             </w:pPr>
             <w:r/>
             <w:r>
               <w:rPr>
                 <w:b w:val="0"/>
-                <w:sz w:val="18"/>
+                <w:sz w:val="16"/>
               </w:rPr>
               <w:t>oculta por el SDK</w:t>
             </w:r>
@@ -543,17 +742,17 @@
         </w:tc>
         <w:tc>
           <w:tcPr>
-            <w:tcW w:type="dxa" w:w="2948"/>
+            <w:tcW w:type="dxa" w:w="3005"/>
           </w:tcPr>
           <w:p>
             <w:pPr>
-              <w:spacing w:after="20" w:before="20"/>
+              <w:spacing w:after="0" w:before="0"/>
             </w:pPr>
             <w:r/>
             <w:r>
               <w:rPr>
                 <w:b w:val="0"/>
-                <w:sz w:val="18"/>
+                <w:sz w:val="16"/>
               </w:rPr>
               <w:t>129–159 ms (prom 140)</w:t>
             </w:r>
@@ -565,13 +764,13 @@
           </w:tcPr>
           <w:p>
             <w:pPr>
-              <w:spacing w:after="20" w:before="20"/>
+              <w:spacing w:after="0" w:before="0"/>
             </w:pPr>
             <w:r/>
             <w:r>
               <w:rPr>
                 <w:b w:val="0"/>
-                <w:sz w:val="18"/>
+                <w:sz w:val="16"/>
               </w:rPr>
               <w:t>N/A (QoS 0)</w:t>
             </w:r>
@@ -581,37 +780,37 @@
       <w:tr>
         <w:tc>
           <w:tcPr>
-            <w:tcW w:type="dxa" w:w="2098"/>
+            <w:tcW w:type="dxa" w:w="2211"/>
             <w:shd w:val="clear" w:fill="EEF2FF"/>
           </w:tcPr>
           <w:p>
             <w:pPr>
-              <w:spacing w:after="20" w:before="20"/>
+              <w:spacing w:after="0" w:before="0"/>
             </w:pPr>
             <w:r/>
             <w:r>
               <w:rPr>
                 <w:b/>
-                <w:sz w:val="18"/>
+                <w:sz w:val="16"/>
               </w:rPr>
-              <w:t>Latencia publish→visible</w:t>
+              <w:t>Latencia publish→visible en Central</w:t>
             </w:r>
           </w:p>
         </w:tc>
         <w:tc>
           <w:tcPr>
-            <w:tcW w:type="dxa" w:w="2438"/>
+            <w:tcW w:type="dxa" w:w="2381"/>
             <w:shd w:val="clear" w:fill="EEF2FF"/>
           </w:tcPr>
           <w:p>
             <w:pPr>
-              <w:spacing w:after="20" w:before="20"/>
+              <w:spacing w:after="0" w:before="0"/>
             </w:pPr>
             <w:r/>
             <w:r>
               <w:rPr>
                 <w:b w:val="0"/>
-                <w:sz w:val="18"/>
+                <w:sz w:val="16"/>
               </w:rPr>
               <w:t>pocos s (1–5 s)</w:t>
             </w:r>
@@ -619,18 +818,18 @@
         </w:tc>
         <w:tc>
           <w:tcPr>
-            <w:tcW w:type="dxa" w:w="2948"/>
+            <w:tcW w:type="dxa" w:w="3005"/>
             <w:shd w:val="clear" w:fill="EEF2FF"/>
           </w:tcPr>
           <w:p>
             <w:pPr>
-              <w:spacing w:after="20" w:before="20"/>
+              <w:spacing w:after="0" w:before="0"/>
             </w:pPr>
             <w:r/>
             <w:r>
               <w:rPr>
                 <w:b w:val="0"/>
-                <w:sz w:val="18"/>
+                <w:sz w:val="16"/>
               </w:rPr>
               <w:t>pocos s (1–5 s)</w:t>
             </w:r>
@@ -643,13 +842,13 @@
           </w:tcPr>
           <w:p>
             <w:pPr>
-              <w:spacing w:after="20" w:before="20"/>
+              <w:spacing w:after="0" w:before="0"/>
             </w:pPr>
             <w:r/>
             <w:r>
               <w:rPr>
                 <w:b w:val="0"/>
-                <w:sz w:val="18"/>
+                <w:sz w:val="16"/>
               </w:rPr>
               <w:t>pocos s</w:t>
             </w:r>
@@ -659,17 +858,17 @@
       <w:tr>
         <w:tc>
           <w:tcPr>
-            <w:tcW w:type="dxa" w:w="2098"/>
+            <w:tcW w:type="dxa" w:w="2211"/>
           </w:tcPr>
           <w:p>
             <w:pPr>
-              <w:spacing w:after="20" w:before="20"/>
+              <w:spacing w:after="0" w:before="0"/>
             </w:pPr>
             <w:r/>
             <w:r>
               <w:rPr>
                 <w:b/>
-                <w:sz w:val="18"/>
+                <w:sz w:val="16"/>
               </w:rPr>
               <w:t>Corte de red 10–20 s</w:t>
             </w:r>
@@ -677,17 +876,17 @@
         </w:tc>
         <w:tc>
           <w:tcPr>
-            <w:tcW w:type="dxa" w:w="2438"/>
+            <w:tcW w:type="dxa" w:w="2381"/>
           </w:tcPr>
           <w:p>
             <w:pPr>
-              <w:spacing w:after="20" w:before="20"/>
+              <w:spacing w:after="0" w:before="0"/>
             </w:pPr>
             <w:r/>
             <w:r>
               <w:rPr>
                 <w:b w:val="0"/>
-                <w:sz w:val="18"/>
+                <w:sz w:val="16"/>
               </w:rPr>
               <w:t>reconecta solo</w:t>
             </w:r>
@@ -695,17 +894,17 @@
         </w:tc>
         <w:tc>
           <w:tcPr>
-            <w:tcW w:type="dxa" w:w="2948"/>
+            <w:tcW w:type="dxa" w:w="3005"/>
           </w:tcPr>
           <w:p>
             <w:pPr>
-              <w:spacing w:after="20" w:before="20"/>
+              <w:spacing w:after="0" w:before="0"/>
             </w:pPr>
             <w:r/>
             <w:r>
               <w:rPr>
                 <w:b w:val="0"/>
-                <w:sz w:val="18"/>
+                <w:sz w:val="16"/>
               </w:rPr>
               <w:t>reconecta ~2 s, encola y hace flush (0 pérdida)</w:t>
             </w:r>
@@ -717,13 +916,13 @@
           </w:tcPr>
           <w:p>
             <w:pPr>
-              <w:spacing w:after="20" w:before="20"/>
+              <w:spacing w:after="0" w:before="0"/>
             </w:pPr>
             <w:r/>
             <w:r>
               <w:rPr>
                 <w:b w:val="0"/>
-                <w:sz w:val="18"/>
+                <w:sz w:val="16"/>
               </w:rPr>
               <w:t>reconecta en loop()</w:t>
             </w:r>
@@ -733,18 +932,18 @@
       <w:tr>
         <w:tc>
           <w:tcPr>
-            <w:tcW w:type="dxa" w:w="2098"/>
+            <w:tcW w:type="dxa" w:w="2211"/>
             <w:shd w:val="clear" w:fill="EEF2FF"/>
           </w:tcPr>
           <w:p>
             <w:pPr>
-              <w:spacing w:after="20" w:before="20"/>
+              <w:spacing w:after="0" w:before="0"/>
             </w:pPr>
             <w:r/>
             <w:r>
               <w:rPr>
                 <w:b/>
-                <w:sz w:val="18"/>
+                <w:sz w:val="16"/>
               </w:rPr>
               <w:t>QoS usado</w:t>
             </w:r>
@@ -752,18 +951,18 @@
         </w:tc>
         <w:tc>
           <w:tcPr>
-            <w:tcW w:type="dxa" w:w="2438"/>
+            <w:tcW w:type="dxa" w:w="2381"/>
             <w:shd w:val="clear" w:fill="EEF2FF"/>
           </w:tcPr>
           <w:p>
             <w:pPr>
-              <w:spacing w:after="20" w:before="20"/>
+              <w:spacing w:after="0" w:before="0"/>
             </w:pPr>
             <w:r/>
             <w:r>
               <w:rPr>
                 <w:b w:val="0"/>
-                <w:sz w:val="18"/>
+                <w:sz w:val="16"/>
               </w:rPr>
               <w:t>1 (fijo)</w:t>
             </w:r>
@@ -771,18 +970,18 @@
         </w:tc>
         <w:tc>
           <w:tcPr>
-            <w:tcW w:type="dxa" w:w="2948"/>
+            <w:tcW w:type="dxa" w:w="3005"/>
             <w:shd w:val="clear" w:fill="EEF2FF"/>
           </w:tcPr>
           <w:p>
             <w:pPr>
-              <w:spacing w:after="20" w:before="20"/>
+              <w:spacing w:after="0" w:before="0"/>
             </w:pPr>
             <w:r/>
             <w:r>
               <w:rPr>
                 <w:b w:val="0"/>
-                <w:sz w:val="18"/>
+                <w:sz w:val="16"/>
               </w:rPr>
               <w:t>0 y 1 (a elección)</w:t>
             </w:r>
@@ -795,13 +994,13 @@
           </w:tcPr>
           <w:p>
             <w:pPr>
-              <w:spacing w:after="20" w:before="20"/>
+              <w:spacing w:after="0" w:before="0"/>
             </w:pPr>
             <w:r/>
             <w:r>
               <w:rPr>
                 <w:b w:val="0"/>
-                <w:sz w:val="18"/>
+                <w:sz w:val="16"/>
               </w:rPr>
               <w:t>0 (límite PubSubClient)</w:t>
             </w:r>
@@ -811,35 +1010,35 @@
       <w:tr>
         <w:tc>
           <w:tcPr>
-            <w:tcW w:type="dxa" w:w="2098"/>
+            <w:tcW w:type="dxa" w:w="2211"/>
           </w:tcPr>
           <w:p>
             <w:pPr>
-              <w:spacing w:after="20" w:before="20"/>
+              <w:spacing w:after="0" w:before="0"/>
             </w:pPr>
             <w:r/>
             <w:r>
               <w:rPr>
                 <w:b/>
-                <w:sz w:val="18"/>
+                <w:sz w:val="16"/>
               </w:rPr>
-              <w:t>QoS 2</w:t>
+              <w:t>QoS 2 hacia Central</w:t>
             </w:r>
           </w:p>
         </w:tc>
         <w:tc>
           <w:tcPr>
-            <w:tcW w:type="dxa" w:w="2438"/>
+            <w:tcW w:type="dxa" w:w="2381"/>
           </w:tcPr>
           <w:p>
             <w:pPr>
-              <w:spacing w:after="20" w:before="20"/>
+              <w:spacing w:after="0" w:before="0"/>
             </w:pPr>
             <w:r/>
             <w:r>
               <w:rPr>
                 <w:b w:val="0"/>
-                <w:sz w:val="18"/>
+                <w:sz w:val="16"/>
               </w:rPr>
               <w:t>n/a</w:t>
             </w:r>
@@ -847,17 +1046,17 @@
         </w:tc>
         <w:tc>
           <w:tcPr>
-            <w:tcW w:type="dxa" w:w="2948"/>
+            <w:tcW w:type="dxa" w:w="3005"/>
           </w:tcPr>
           <w:p>
             <w:pPr>
-              <w:spacing w:after="20" w:before="20"/>
+              <w:spacing w:after="0" w:before="0"/>
             </w:pPr>
             <w:r/>
             <w:r>
               <w:rPr>
                 <w:b w:val="0"/>
-                <w:sz w:val="18"/>
+                <w:sz w:val="16"/>
               </w:rPr>
               <w:t>Hub responde PUBACK ⇒ degrada a QoS 1</w:t>
             </w:r>
@@ -869,13 +1068,13 @@
           </w:tcPr>
           <w:p>
             <w:pPr>
-              <w:spacing w:after="20" w:before="20"/>
+              <w:spacing w:after="0" w:before="0"/>
             </w:pPr>
             <w:r/>
             <w:r>
               <w:rPr>
                 <w:b w:val="0"/>
-                <w:sz w:val="18"/>
+                <w:sz w:val="16"/>
               </w:rPr>
               <w:t>no soportado</w:t>
             </w:r>
@@ -883,6 +1082,121 @@
         </w:tc>
       </w:tr>
     </w:tbl>
+    <w:tbl>
+      <w:tblPr>
+        <w:tblW w:type="auto" w:w="0"/>
+        <w:jc w:val="center"/>
+        <w:tblLook w:firstColumn="1" w:firstRow="1" w:lastColumn="0" w:lastRow="0" w:noHBand="0" w:noVBand="1" w:val="04A0"/>
+      </w:tblPr>
+      <w:tblGrid>
+        <w:gridCol w:w="5159"/>
+        <w:gridCol w:w="5159"/>
+      </w:tblGrid>
+      <w:tr>
+        <w:tc>
+          <w:tcPr>
+            <w:tcW w:type="dxa" w:w="5159"/>
+          </w:tcPr>
+          <w:p>
+            <w:pPr>
+              <w:jc w:val="center"/>
+            </w:pPr>
+            <w:r>
+              <w:drawing>
+                <wp:inline xmlns:a="http://schemas.openxmlformats.org/drawingml/2006/main" xmlns:pic="http://schemas.openxmlformats.org/drawingml/2006/picture">
+                  <wp:extent cx="2916000" cy="2665033"/>
+                  <wp:docPr id="7" name="Picture 7"/>
+                  <wp:cNvGraphicFramePr>
+                    <a:graphicFrameLocks noChangeAspect="1"/>
+                  </wp:cNvGraphicFramePr>
+                  <a:graphic>
+                    <a:graphicData uri="http://schemas.openxmlformats.org/drawingml/2006/picture">
+                      <pic:pic>
+                        <pic:nvPicPr>
+                          <pic:cNvPr id="0" name="02-corte-reconexion.png"/>
+                          <pic:cNvPicPr/>
+                        </pic:nvPicPr>
+                        <pic:blipFill>
+                          <a:blip r:embed="rId15"/>
+                          <a:stretch>
+                            <a:fillRect/>
+                          </a:stretch>
+                        </pic:blipFill>
+                        <pic:spPr>
+                          <a:xfrm>
+                            <a:off x="0" y="0"/>
+                            <a:ext cx="2916000" cy="2665033"/>
+                          </a:xfrm>
+                          <a:prstGeom prst="rect"/>
+                        </pic:spPr>
+                      </pic:pic>
+                    </a:graphicData>
+                  </a:graphic>
+                </wp:inline>
+              </w:drawing>
+            </w:r>
+          </w:p>
+        </w:tc>
+        <w:tc>
+          <w:tcPr>
+            <w:tcW w:type="dxa" w:w="5159"/>
+          </w:tcPr>
+          <w:p>
+            <w:pPr>
+              <w:jc w:val="center"/>
+            </w:pPr>
+            <w:r>
+              <w:drawing>
+                <wp:inline xmlns:a="http://schemas.openxmlformats.org/drawingml/2006/main" xmlns:pic="http://schemas.openxmlformats.org/drawingml/2006/picture">
+                  <wp:extent cx="3311999" cy="1827310"/>
+                  <wp:docPr id="8" name="Picture 8"/>
+                  <wp:cNvGraphicFramePr>
+                    <a:graphicFrameLocks noChangeAspect="1"/>
+                  </wp:cNvGraphicFramePr>
+                  <a:graphic>
+                    <a:graphicData uri="http://schemas.openxmlformats.org/drawingml/2006/picture">
+                      <pic:pic>
+                        <pic:nvPicPr>
+                          <pic:cNvPr id="0" name="03-qos2-degradado.png"/>
+                          <pic:cNvPicPr/>
+                        </pic:nvPicPr>
+                        <pic:blipFill>
+                          <a:blip r:embed="rId16"/>
+                          <a:stretch>
+                            <a:fillRect/>
+                          </a:stretch>
+                        </pic:blipFill>
+                        <pic:spPr>
+                          <a:xfrm>
+                            <a:off x="0" y="0"/>
+                            <a:ext cx="3311999" cy="1827310"/>
+                          </a:xfrm>
+                          <a:prstGeom prst="rect"/>
+                        </pic:spPr>
+                      </pic:pic>
+                    </a:graphicData>
+                  </a:graphic>
+                </wp:inline>
+              </w:drawing>
+            </w:r>
+          </w:p>
+        </w:tc>
+      </w:tr>
+    </w:tbl>
+    <w:p>
+      <w:pPr>
+        <w:spacing w:before="20" w:after="60"/>
+        <w:jc w:val="center"/>
+      </w:pPr>
+      <w:r>
+        <w:rPr>
+          <w:i/>
+          <w:color w:val="64748B"/>
+          <w:sz w:val="15"/>
+        </w:rPr>
+        <w:t>Fig. 4 — (izq.) corte de red 16 s: DESCONECTADO (rc=7), encolado y reconexión automática con flush sin pérdida (ACK de 15.4 s→0.5 s).  (der.) QoS 2: el Hub responde PUBACK en vez de PUBREC (degrada a QoS 1).</w:t>
+      </w:r>
+    </w:p>
     <w:p>
       <w:pPr>
         <w:spacing w:before="100" w:after="40"/>
@@ -891,9 +1205,9 @@
         <w:rPr>
           <w:b/>
           <w:color w:val="1D4ED8"/>
-          <w:sz w:val="25"/>
+          <w:sz w:val="23"/>
         </w:rPr>
-        <w:t>4. Comparación de los tres caminos</w:t>
+        <w:t>5. Comparación de los tres caminos (Etapa 4)</w:t>
       </w:r>
     </w:p>
     <w:tbl>
@@ -904,10 +1218,10 @@
         <w:tblLook w:firstColumn="1" w:firstRow="1" w:lastColumn="0" w:lastRow="0" w:noHBand="0" w:noVBand="1" w:val="04A0"/>
       </w:tblPr>
       <w:tblGrid>
-        <w:gridCol w:w="2523"/>
-        <w:gridCol w:w="2523"/>
-        <w:gridCol w:w="2523"/>
-        <w:gridCol w:w="2523"/>
+        <w:gridCol w:w="2579"/>
+        <w:gridCol w:w="2579"/>
+        <w:gridCol w:w="2579"/>
+        <w:gridCol w:w="2579"/>
       </w:tblGrid>
       <w:tr>
         <w:tc>
@@ -917,7 +1231,7 @@
           </w:tcPr>
           <w:p>
             <w:pPr>
-              <w:spacing w:after="20" w:before="20"/>
+              <w:spacing w:after="0" w:before="0"/>
               <w:jc w:val="center"/>
             </w:pPr>
             <w:r/>
@@ -925,7 +1239,7 @@
               <w:rPr>
                 <w:b/>
                 <w:color w:val="FFFFFF"/>
-                <w:sz w:val="19"/>
+                <w:sz w:val="17"/>
               </w:rPr>
               <w:t>Criterio</w:t>
             </w:r>
@@ -938,7 +1252,7 @@
           </w:tcPr>
           <w:p>
             <w:pPr>
-              <w:spacing w:after="20" w:before="20"/>
+              <w:spacing w:after="0" w:before="0"/>
               <w:jc w:val="center"/>
             </w:pPr>
             <w:r/>
@@ -946,7 +1260,7 @@
               <w:rPr>
                 <w:b/>
                 <w:color w:val="FFFFFF"/>
-                <w:sz w:val="19"/>
+                <w:sz w:val="17"/>
               </w:rPr>
               <w:t>SDK Python</w:t>
             </w:r>
@@ -959,7 +1273,7 @@
           </w:tcPr>
           <w:p>
             <w:pPr>
-              <w:spacing w:after="20" w:before="20"/>
+              <w:spacing w:after="0" w:before="0"/>
               <w:jc w:val="center"/>
             </w:pPr>
             <w:r/>
@@ -967,7 +1281,7 @@
               <w:rPr>
                 <w:b/>
                 <w:color w:val="FFFFFF"/>
-                <w:sz w:val="19"/>
+                <w:sz w:val="17"/>
               </w:rPr>
               <w:t>MQTT explícito</w:t>
             </w:r>
@@ -980,7 +1294,7 @@
           </w:tcPr>
           <w:p>
             <w:pPr>
-              <w:spacing w:after="20" w:before="20"/>
+              <w:spacing w:after="0" w:before="0"/>
               <w:jc w:val="center"/>
             </w:pPr>
             <w:r/>
@@ -988,7 +1302,7 @@
               <w:rPr>
                 <w:b/>
                 <w:color w:val="FFFFFF"/>
-                <w:sz w:val="19"/>
+                <w:sz w:val="17"/>
               </w:rPr>
               <w:t>ESP32 Arduino</w:t>
             </w:r>
@@ -1002,13 +1316,13 @@
           </w:tcPr>
           <w:p>
             <w:pPr>
-              <w:spacing w:after="20" w:before="20"/>
+              <w:spacing w:after="0" w:before="0"/>
             </w:pPr>
             <w:r/>
             <w:r>
               <w:rPr>
                 <w:b/>
-                <w:sz w:val="18"/>
+                <w:sz w:val="16"/>
               </w:rPr>
               <w:t>Facilidad de implementación</w:t>
             </w:r>
@@ -1020,13 +1334,13 @@
           </w:tcPr>
           <w:p>
             <w:pPr>
-              <w:spacing w:after="20" w:before="20"/>
+              <w:spacing w:after="0" w:before="0"/>
             </w:pPr>
             <w:r/>
             <w:r>
               <w:rPr>
                 <w:b w:val="0"/>
-                <w:sz w:val="18"/>
+                <w:sz w:val="16"/>
               </w:rPr>
               <w:t>Alta (pocas líneas)</w:t>
             </w:r>
@@ -1038,13 +1352,13 @@
           </w:tcPr>
           <w:p>
             <w:pPr>
-              <w:spacing w:after="20" w:before="20"/>
+              <w:spacing w:after="0" w:before="0"/>
             </w:pPr>
             <w:r/>
             <w:r>
               <w:rPr>
                 <w:b w:val="0"/>
-                <w:sz w:val="18"/>
+                <w:sz w:val="16"/>
               </w:rPr>
               <w:t>Media (SAS/topics/QoS a mano)</w:t>
             </w:r>
@@ -1056,13 +1370,13 @@
           </w:tcPr>
           <w:p>
             <w:pPr>
-              <w:spacing w:after="20" w:before="20"/>
+              <w:spacing w:after="0" w:before="0"/>
             </w:pPr>
             <w:r/>
             <w:r>
               <w:rPr>
                 <w:b w:val="0"/>
-                <w:sz w:val="18"/>
+                <w:sz w:val="16"/>
               </w:rPr>
               <w:t>Media-baja (C++, mbedTLS)</w:t>
             </w:r>
@@ -1077,13 +1391,13 @@
           </w:tcPr>
           <w:p>
             <w:pPr>
-              <w:spacing w:after="20" w:before="20"/>
+              <w:spacing w:after="0" w:before="0"/>
             </w:pPr>
             <w:r/>
             <w:r>
               <w:rPr>
                 <w:b/>
-                <w:sz w:val="18"/>
+                <w:sz w:val="16"/>
               </w:rPr>
               <w:t>Control del protocolo</w:t>
             </w:r>
@@ -1096,13 +1410,13 @@
           </w:tcPr>
           <w:p>
             <w:pPr>
-              <w:spacing w:after="20" w:before="20"/>
+              <w:spacing w:after="0" w:before="0"/>
             </w:pPr>
             <w:r/>
             <w:r>
               <w:rPr>
                 <w:b w:val="0"/>
-                <w:sz w:val="18"/>
+                <w:sz w:val="16"/>
               </w:rPr>
               <w:t>Bajo (caja negra)</w:t>
             </w:r>
@@ -1115,13 +1429,13 @@
           </w:tcPr>
           <w:p>
             <w:pPr>
-              <w:spacing w:after="20" w:before="20"/>
+              <w:spacing w:after="0" w:before="0"/>
             </w:pPr>
             <w:r/>
             <w:r>
               <w:rPr>
                 <w:b w:val="0"/>
-                <w:sz w:val="18"/>
+                <w:sz w:val="16"/>
               </w:rPr>
               <w:t>Total</w:t>
             </w:r>
@@ -1134,13 +1448,13 @@
           </w:tcPr>
           <w:p>
             <w:pPr>
-              <w:spacing w:after="20" w:before="20"/>
+              <w:spacing w:after="0" w:before="0"/>
             </w:pPr>
             <w:r/>
             <w:r>
               <w:rPr>
                 <w:b w:val="0"/>
-                <w:sz w:val="18"/>
+                <w:sz w:val="16"/>
               </w:rPr>
               <w:t>Alto (PubSubClient)</w:t>
             </w:r>
@@ -1154,13 +1468,13 @@
           </w:tcPr>
           <w:p>
             <w:pPr>
-              <w:spacing w:after="20" w:before="20"/>
+              <w:spacing w:after="0" w:before="0"/>
             </w:pPr>
             <w:r/>
             <w:r>
               <w:rPr>
                 <w:b/>
-                <w:sz w:val="18"/>
+                <w:sz w:val="16"/>
               </w:rPr>
               <w:t>Payload / formato</w:t>
             </w:r>
@@ -1172,13 +1486,13 @@
           </w:tcPr>
           <w:p>
             <w:pPr>
-              <w:spacing w:after="20" w:before="20"/>
+              <w:spacing w:after="0" w:before="0"/>
             </w:pPr>
             <w:r/>
             <w:r>
               <w:rPr>
                 <w:b w:val="0"/>
-                <w:sz w:val="18"/>
+                <w:sz w:val="16"/>
               </w:rPr>
               <w:t>No se controla</w:t>
             </w:r>
@@ -1190,13 +1504,13 @@
           </w:tcPr>
           <w:p>
             <w:pPr>
-              <w:spacing w:after="20" w:before="20"/>
+              <w:spacing w:after="0" w:before="0"/>
             </w:pPr>
             <w:r/>
             <w:r>
               <w:rPr>
                 <w:b w:val="0"/>
-                <w:sz w:val="18"/>
+                <w:sz w:val="16"/>
               </w:rPr>
               <w:t>Se controla (compacto)</w:t>
             </w:r>
@@ -1208,13 +1522,13 @@
           </w:tcPr>
           <w:p>
             <w:pPr>
-              <w:spacing w:after="20" w:before="20"/>
+              <w:spacing w:after="0" w:before="0"/>
             </w:pPr>
             <w:r/>
             <w:r>
               <w:rPr>
                 <w:b w:val="0"/>
-                <w:sz w:val="18"/>
+                <w:sz w:val="16"/>
               </w:rPr>
               <w:t>Se controla en firmware</w:t>
             </w:r>
@@ -1229,15 +1543,15 @@
           </w:tcPr>
           <w:p>
             <w:pPr>
-              <w:spacing w:after="20" w:before="20"/>
+              <w:spacing w:after="0" w:before="0"/>
             </w:pPr>
             <w:r/>
             <w:r>
               <w:rPr>
                 <w:b/>
-                <w:sz w:val="18"/>
+                <w:sz w:val="16"/>
               </w:rPr>
-              <w:t>Reconexión</w:t>
+              <w:t>Latencia percibida</w:t>
             </w:r>
           </w:p>
         </w:tc>
@@ -1248,15 +1562,15 @@
           </w:tcPr>
           <w:p>
             <w:pPr>
-              <w:spacing w:after="20" w:before="20"/>
+              <w:spacing w:after="0" w:before="0"/>
             </w:pPr>
             <w:r/>
             <w:r>
               <w:rPr>
                 <w:b w:val="0"/>
-                <w:sz w:val="18"/>
+                <w:sz w:val="16"/>
               </w:rPr>
-              <w:t>Automática</w:t>
+              <w:t>~140 ms (oculta)</w:t>
             </w:r>
           </w:p>
         </w:tc>
@@ -1267,15 +1581,15 @@
           </w:tcPr>
           <w:p>
             <w:pPr>
-              <w:spacing w:after="20" w:before="20"/>
+              <w:spacing w:after="0" w:before="0"/>
             </w:pPr>
             <w:r/>
             <w:r>
               <w:rPr>
                 <w:b w:val="0"/>
-                <w:sz w:val="18"/>
+                <w:sz w:val="16"/>
               </w:rPr>
-              <w:t>Auto (loop paho); renovar SAS</w:t>
+              <w:t>~140 ms (medible)</w:t>
             </w:r>
           </w:p>
         </w:tc>
@@ -1286,15 +1600,15 @@
           </w:tcPr>
           <w:p>
             <w:pPr>
-              <w:spacing w:after="20" w:before="20"/>
+              <w:spacing w:after="0" w:before="0"/>
             </w:pPr>
             <w:r/>
             <w:r>
               <w:rPr>
                 <w:b w:val="0"/>
-                <w:sz w:val="18"/>
+                <w:sz w:val="16"/>
               </w:rPr>
-              <w:t>Manual en loop()</w:t>
+              <w:t>similar</w:t>
             </w:r>
           </w:p>
         </w:tc>
@@ -1306,15 +1620,15 @@
           </w:tcPr>
           <w:p>
             <w:pPr>
-              <w:spacing w:after="20" w:before="20"/>
+              <w:spacing w:after="0" w:before="0"/>
             </w:pPr>
             <w:r/>
             <w:r>
               <w:rPr>
                 <w:b/>
-                <w:sz w:val="18"/>
+                <w:sz w:val="16"/>
               </w:rPr>
-              <w:t>Útil para…</w:t>
+              <w:t>Reconexión</w:t>
             </w:r>
           </w:p>
         </w:tc>
@@ -1324,15 +1638,15 @@
           </w:tcPr>
           <w:p>
             <w:pPr>
-              <w:spacing w:after="20" w:before="20"/>
+              <w:spacing w:after="0" w:before="0"/>
             </w:pPr>
             <w:r/>
             <w:r>
               <w:rPr>
                 <w:b w:val="0"/>
-                <w:sz w:val="18"/>
+                <w:sz w:val="16"/>
               </w:rPr>
-              <w:t>Producción rápida</w:t>
+              <w:t>Automática</w:t>
             </w:r>
           </w:p>
         </w:tc>
@@ -1342,15 +1656,15 @@
           </w:tcPr>
           <w:p>
             <w:pPr>
-              <w:spacing w:after="20" w:before="20"/>
+              <w:spacing w:after="0" w:before="0"/>
             </w:pPr>
             <w:r/>
             <w:r>
               <w:rPr>
                 <w:b w:val="0"/>
-                <w:sz w:val="18"/>
+                <w:sz w:val="16"/>
               </w:rPr>
-              <w:t>Depurar / integrar / portar</w:t>
+              <w:t>Auto (loop paho); renovar SAS</w:t>
             </w:r>
           </w:p>
         </w:tc>
@@ -1360,13 +1674,91 @@
           </w:tcPr>
           <w:p>
             <w:pPr>
-              <w:spacing w:after="20" w:before="20"/>
+              <w:spacing w:after="0" w:before="0"/>
             </w:pPr>
             <w:r/>
             <w:r>
               <w:rPr>
                 <w:b w:val="0"/>
-                <w:sz w:val="18"/>
+                <w:sz w:val="16"/>
+              </w:rPr>
+              <w:t>Manual en loop()</w:t>
+            </w:r>
+          </w:p>
+        </w:tc>
+      </w:tr>
+      <w:tr>
+        <w:tc>
+          <w:tcPr>
+            <w:tcW w:type="dxa" w:w="2268"/>
+            <w:shd w:val="clear" w:fill="EEF2FF"/>
+          </w:tcPr>
+          <w:p>
+            <w:pPr>
+              <w:spacing w:after="0" w:before="0"/>
+            </w:pPr>
+            <w:r/>
+            <w:r>
+              <w:rPr>
+                <w:b/>
+                <w:sz w:val="16"/>
+              </w:rPr>
+              <w:t>Útil para…</w:t>
+            </w:r>
+          </w:p>
+        </w:tc>
+        <w:tc>
+          <w:tcPr>
+            <w:tcW w:type="dxa" w:w="2381"/>
+            <w:shd w:val="clear" w:fill="EEF2FF"/>
+          </w:tcPr>
+          <w:p>
+            <w:pPr>
+              <w:spacing w:after="0" w:before="0"/>
+            </w:pPr>
+            <w:r/>
+            <w:r>
+              <w:rPr>
+                <w:b w:val="0"/>
+                <w:sz w:val="16"/>
+              </w:rPr>
+              <w:t>Producción rápida</w:t>
+            </w:r>
+          </w:p>
+        </w:tc>
+        <w:tc>
+          <w:tcPr>
+            <w:tcW w:type="dxa" w:w="2721"/>
+            <w:shd w:val="clear" w:fill="EEF2FF"/>
+          </w:tcPr>
+          <w:p>
+            <w:pPr>
+              <w:spacing w:after="0" w:before="0"/>
+            </w:pPr>
+            <w:r/>
+            <w:r>
+              <w:rPr>
+                <w:b w:val="0"/>
+                <w:sz w:val="16"/>
+              </w:rPr>
+              <w:t>Depurar / integrar / portar</w:t>
+            </w:r>
+          </w:p>
+        </w:tc>
+        <w:tc>
+          <w:tcPr>
+            <w:tcW w:type="dxa" w:w="2608"/>
+            <w:shd w:val="clear" w:fill="EEF2FF"/>
+          </w:tcPr>
+          <w:p>
+            <w:pPr>
+              <w:spacing w:after="0" w:before="0"/>
+            </w:pPr>
+            <w:r/>
+            <w:r>
+              <w:rPr>
+                <w:b w:val="0"/>
+                <w:sz w:val="16"/>
               </w:rPr>
               <w:t>Hardware real / edge</w:t>
             </w:r>
@@ -1382,38 +1774,38 @@
         <w:rPr>
           <w:b/>
           <w:color w:val="1D4ED8"/>
-          <w:sz w:val="24"/>
+          <w:sz w:val="23"/>
         </w:rPr>
-        <w:t>5. Conclusión — QoS y cuándo usar cada camino</w:t>
+        <w:t>6. Conclusión — QoS y cuándo usar cada camino</w:t>
       </w:r>
     </w:p>
     <w:p>
       <w:pPr>
-        <w:spacing w:after="80"/>
+        <w:spacing w:after="60" w:before="0"/>
       </w:pPr>
       <w:r>
         <w:rPr>
           <w:color w:val="1E293B"/>
-          <w:sz w:val="19"/>
+          <w:sz w:val="18"/>
         </w:rPr>
         <w:t>QoS: IoT Central (IoT Hub) admite QoS 0 y 1. QoS 2 no está implementado: al publicar en QoS 2 el Hub responde con PUBACK (el acuse de QoS 1) en lugar del handshake PUBREC/PUBREL/PUBCOMP, es decir, lo degrada a QoS 1 y no ofrece la garantía exactly-once. Para telemetría ambiental QoS 1 es el punto óptimo (entrega al-menos-una-vez con encolado y reconexión, como demostró la prueba de corte); QoS 0 sirve para datos de alta frecuencia donde perder alguna muestra es tolerable.</w:t>
       </w:r>
     </w:p>
     <w:p>
       <w:pPr>
-        <w:spacing w:after="40"/>
+        <w:spacing w:after="40" w:before="0"/>
       </w:pPr>
       <w:r>
         <w:rPr>
           <w:color w:val="1E293B"/>
-          <w:sz w:val="19"/>
+          <w:sz w:val="18"/>
         </w:rPr>
         <w:t>Cuándo cada uno: el SDK conviene para desarrollar rápido sin preocuparse por el protocolo (producción típica). El cliente MQTT explícito conviene cuando se necesita control fino —formato del payload, elegir QoS, integrarlo en un cliente propio, depurar el tráfico o portarlo a un lenguaje sin SDK—. El ESP32/Arduino es el camino natural en hardware real: su firmware ya es MQTT explícito.</w:t>
       </w:r>
     </w:p>
     <w:sectPr>
       <w:pgSz w:w="11906" w:h="16838"/>
-      <w:pgMar w:top="907" w:right="907" w:bottom="907" w:left="907" w:header="720" w:footer="720" w:gutter="0"/>
+      <w:pgMar w:top="794" w:right="794" w:bottom="794" w:left="794" w:header="720" w:footer="720" w:gutter="0"/>
       <w:cols w:space="720"/>
       <w:docGrid w:linePitch="360"/>
     </w:sectPr>
@@ -1786,7 +2178,7 @@
     <w:rsid w:val="00FC693F"/>
     <w:rPr>
       <w:rFonts w:ascii="Calibri" w:hAnsi="Calibri"/>
-      <w:sz w:val="20"/>
+      <w:sz w:val="19"/>
     </w:rPr>
   </w:style>
   <w:style w:type="paragraph" w:styleId="Header">

</xml_diff>

<commit_message>
Repo autocontenido: incluir proyecto Wokwi (ESP32) + link GitHub en informe y README
</commit_message>
<xml_diff>
--- a/Informe_Laboratorio3.docx
+++ b/Informe_Laboratorio3.docx
@@ -30,6 +30,18 @@
     </w:p>
     <w:p>
       <w:pPr>
+        <w:spacing w:after="20"/>
+      </w:pPr>
+      <w:r>
+        <w:rPr>
+          <w:color w:val="64748B"/>
+          <w:sz w:val="17"/>
+        </w:rPr>
+        <w:t>IoT + Cloud + Sistemas Distribuidos · UNAB · Escenario UNAB-Ambiental · App IoT Central: medidordeclima2026</w:t>
+      </w:r>
+    </w:p>
+    <w:p>
+      <w:pPr>
         <w:spacing w:after="80"/>
       </w:pPr>
       <w:r>
@@ -37,7 +49,15 @@
           <w:color w:val="64748B"/>
           <w:sz w:val="17"/>
         </w:rPr>
-        <w:t>IoT + Cloud + Sistemas Distribuidos · UNAB · Escenario UNAB-Ambiental · App IoT Central: medidordeclima2026</w:t>
+        <w:t xml:space="preserve">Repositorio: </w:t>
+      </w:r>
+      <w:r>
+        <w:rPr>
+          <w:b/>
+          <w:color w:val="1D4ED8"/>
+          <w:sz w:val="17"/>
+        </w:rPr>
+        <w:t>https://github.com/Daniverd15/Laboratorio-3</w:t>
       </w:r>
     </w:p>
     <w:p>
@@ -1803,6 +1823,51 @@
         <w:t>Cuándo cada uno: el SDK conviene para desarrollar rápido sin preocuparse por el protocolo (producción típica). El cliente MQTT explícito conviene cuando se necesita control fino —formato del payload, elegir QoS, integrarlo en un cliente propio, depurar el tráfico o portarlo a un lenguaje sin SDK—. El ESP32/Arduino es el camino natural en hardware real: su firmware ya es MQTT explícito.</w:t>
       </w:r>
     </w:p>
+    <w:p>
+      <w:pPr>
+        <w:spacing w:before="100" w:after="40"/>
+      </w:pPr>
+      <w:r>
+        <w:rPr>
+          <w:b/>
+          <w:color w:val="1D4ED8"/>
+          <w:sz w:val="23"/>
+        </w:rPr>
+        <w:t>7. Repositorio y entregables</w:t>
+      </w:r>
+    </w:p>
+    <w:p>
+      <w:pPr>
+        <w:spacing w:after="40"/>
+      </w:pPr>
+      <w:r>
+        <w:rPr>
+          <w:color w:val="1E293B"/>
+          <w:sz w:val="18"/>
+        </w:rPr>
+        <w:t xml:space="preserve">Repositorio (público): </w:t>
+      </w:r>
+      <w:r>
+        <w:rPr>
+          <w:b/>
+          <w:color w:val="1D4ED8"/>
+          <w:sz w:val="18"/>
+        </w:rPr>
+        <w:t>https://github.com/Daniverd15/Laboratorio-3</w:t>
+      </w:r>
+    </w:p>
+    <w:p>
+      <w:pPr>
+        <w:spacing w:after="40" w:before="0"/>
+      </w:pPr>
+      <w:r>
+        <w:rPr>
+          <w:color w:val="1E293B"/>
+          <w:sz w:val="18"/>
+        </w:rPr>
+        <w:t>Contenido: mqtt/mqtt_explicito.py (cliente MQTT explícito con paho: DPS + SAS + publish + QoS) y mqtt-explicito.service · sdk/IoTCentralSender.py (dispositivo SDK del Lab 2, línea base) · wokwi/ (proyecto ESP32, firmware MQTT explícito, sin cambios respecto al Lab 2) · README.md (explica cómo se genera el token SAS, sin secretos en claro) · mediciones/ (logs y CSV reales) · evidencias/ (logs de connect/publish renderizados y 6 capturas de IoT Central) · este informe en PDF. Las credenciales nunca se suben: van en variables de entorno (.env, ignorado por git).</w:t>
+      </w:r>
+    </w:p>
     <w:sectPr>
       <w:pgSz w:w="11906" w:h="16838"/>
       <w:pgMar w:top="794" w:right="794" w:bottom="794" w:left="794" w:header="720" w:footer="720" w:gutter="0"/>

</xml_diff>

<commit_message>
ESP32 Wokwi re-simulado en vivo: Connected + enviando (3 vars con humedad)
- evidencias: 05 serial ESP32, 16 ESP32 Connected en Central, 17 JSON 3 variables
- informe: seccion 3 con ESP32 en vivo (Fig 2-4), tabla y §7 actualizados
- wokwi/: campo humidity->humedad (mapea a la plantilla), clave en placeholder
</commit_message>
<xml_diff>
--- a/Informe_Laboratorio3.docx
+++ b/Informe_Laboratorio3.docx
@@ -275,7 +275,7 @@
           <w:color w:val="1D4ED8"/>
           <w:sz w:val="23"/>
         </w:rPr>
-        <w:t>3. Wokwi y SDK del Lab 2 siguen visibles en la misma app</w:t>
+        <w:t>3. Wokwi y SDK del Lab 2 siguen visibles y enviando en la misma app</w:t>
       </w:r>
     </w:p>
     <w:p>
@@ -287,7 +287,7 @@
           <w:color w:val="1E293B"/>
           <w:sz w:val="18"/>
         </w:rPr>
-        <w:t>Los tres dispositivos de código reportan a la misma app sobre la plantilla Hobo MX-100 v3: el SDK (2c5qb72vl4u), el MQTT explícito (mqtt-explicito-lab3) y el ESP32 de Wokwi (ve8okslkz9), junto a 6 simulados.</w:t>
+        <w:t>Los tres dispositivos de código reportan a la misma app sobre la plantilla Hobo MX-100 v3: el SDK (2c5qb72vl4u), el MQTT explícito (mqtt-explicito-lab3) y el ESP32 de Wokwi (ve8okslkz9), junto a 6 simulados. El ESP32 se simuló headless con wokwi-cli: su firmware Arduino (PubSubClient + SAS por mbedTLS) hace el mismo flujo WiFi → NTP → DPS → IoT Hub y publica las 3 variables, quedando Conectado en vivo.</w:t>
       </w:r>
     </w:p>
     <w:tbl>
@@ -365,7 +365,7 @@
                     <a:graphicData uri="http://schemas.openxmlformats.org/drawingml/2006/picture">
                       <pic:pic>
                         <pic:nvPicPr>
-                          <pic:cNvPr id="0" name="14-sdk-lab2-connected.png"/>
+                          <pic:cNvPr id="0" name="16-esp32-wokwi-connected.png"/>
                           <pic:cNvPicPr/>
                         </pic:nvPicPr>
                         <pic:blipFill>
@@ -402,7 +402,122 @@
           <w:color w:val="64748B"/>
           <w:sz w:val="15"/>
         </w:rPr>
-        <w:t>Fig. 2 — (izq.) la flota completa sobre la plantilla.  (der.) el dispositivo SDK del Lab 2 sigue Conectado y enviando.</w:t>
+        <w:t>Fig. 2 — (izq.) la flota completa sobre la plantilla.  (der.) el ESP32 de Wokwi (ve8okslkz9) Conectado y enviando telemetría en vivo.</w:t>
+      </w:r>
+    </w:p>
+    <w:tbl>
+      <w:tblPr>
+        <w:tblW w:type="auto" w:w="0"/>
+        <w:jc w:val="center"/>
+        <w:tblLook w:firstColumn="1" w:firstRow="1" w:lastColumn="0" w:lastRow="0" w:noHBand="0" w:noVBand="1" w:val="04A0"/>
+      </w:tblPr>
+      <w:tblGrid>
+        <w:gridCol w:w="5159"/>
+        <w:gridCol w:w="5159"/>
+      </w:tblGrid>
+      <w:tr>
+        <w:tc>
+          <w:tcPr>
+            <w:tcW w:type="dxa" w:w="5159"/>
+          </w:tcPr>
+          <w:p>
+            <w:pPr>
+              <w:jc w:val="center"/>
+            </w:pPr>
+            <w:r>
+              <w:drawing>
+                <wp:inline xmlns:a="http://schemas.openxmlformats.org/drawingml/2006/main" xmlns:pic="http://schemas.openxmlformats.org/drawingml/2006/picture">
+                  <wp:extent cx="3096000" cy="2949270"/>
+                  <wp:docPr id="6" name="Picture 6"/>
+                  <wp:cNvGraphicFramePr>
+                    <a:graphicFrameLocks noChangeAspect="1"/>
+                  </wp:cNvGraphicFramePr>
+                  <a:graphic>
+                    <a:graphicData uri="http://schemas.openxmlformats.org/drawingml/2006/picture">
+                      <pic:pic>
+                        <pic:nvPicPr>
+                          <pic:cNvPr id="0" name="14-sdk-lab2-connected.png"/>
+                          <pic:cNvPicPr/>
+                        </pic:nvPicPr>
+                        <pic:blipFill>
+                          <a:blip r:embed="rId14"/>
+                          <a:stretch>
+                            <a:fillRect/>
+                          </a:stretch>
+                        </pic:blipFill>
+                        <pic:spPr>
+                          <a:xfrm>
+                            <a:off x="0" y="0"/>
+                            <a:ext cx="3096000" cy="2949270"/>
+                          </a:xfrm>
+                          <a:prstGeom prst="rect"/>
+                        </pic:spPr>
+                      </pic:pic>
+                    </a:graphicData>
+                  </a:graphic>
+                </wp:inline>
+              </w:drawing>
+            </w:r>
+          </w:p>
+        </w:tc>
+        <w:tc>
+          <w:tcPr>
+            <w:tcW w:type="dxa" w:w="5159"/>
+          </w:tcPr>
+          <w:p>
+            <w:pPr>
+              <w:jc w:val="center"/>
+            </w:pPr>
+            <w:r>
+              <w:drawing>
+                <wp:inline xmlns:a="http://schemas.openxmlformats.org/drawingml/2006/main" xmlns:pic="http://schemas.openxmlformats.org/drawingml/2006/picture">
+                  <wp:extent cx="3096000" cy="2949270"/>
+                  <wp:docPr id="7" name="Picture 7"/>
+                  <wp:cNvGraphicFramePr>
+                    <a:graphicFrameLocks noChangeAspect="1"/>
+                  </wp:cNvGraphicFramePr>
+                  <a:graphic>
+                    <a:graphicData uri="http://schemas.openxmlformats.org/drawingml/2006/picture">
+                      <pic:pic>
+                        <pic:nvPicPr>
+                          <pic:cNvPr id="0" name="15-data-explorer-temperatura.png"/>
+                          <pic:cNvPicPr/>
+                        </pic:nvPicPr>
+                        <pic:blipFill>
+                          <a:blip r:embed="rId15"/>
+                          <a:stretch>
+                            <a:fillRect/>
+                          </a:stretch>
+                        </pic:blipFill>
+                        <pic:spPr>
+                          <a:xfrm>
+                            <a:off x="0" y="0"/>
+                            <a:ext cx="3096000" cy="2949270"/>
+                          </a:xfrm>
+                          <a:prstGeom prst="rect"/>
+                        </pic:spPr>
+                      </pic:pic>
+                    </a:graphicData>
+                  </a:graphic>
+                </wp:inline>
+              </w:drawing>
+            </w:r>
+          </w:p>
+        </w:tc>
+      </w:tr>
+    </w:tbl>
+    <w:p>
+      <w:pPr>
+        <w:spacing w:before="20" w:after="60"/>
+        <w:jc w:val="center"/>
+      </w:pPr>
+      <w:r>
+        <w:rPr>
+          <w:i/>
+          <w:color w:val="64748B"/>
+          <w:sz w:val="15"/>
+        </w:rPr>
+        <w:t>Fig. 3 — (izq.) el SDK del Lab 2 sigue Conectado y enviando.  (der.) Data explorer: temperatura de la flota (últimas 24 h).</w:t>
       </w:r>
     </w:p>
     <w:p>
@@ -413,8 +528,8 @@
       <w:r>
         <w:drawing>
           <wp:inline xmlns:a="http://schemas.openxmlformats.org/drawingml/2006/main" xmlns:pic="http://schemas.openxmlformats.org/drawingml/2006/picture">
-            <wp:extent cx="4464000" cy="4252436"/>
-            <wp:docPr id="6" name="Picture 6"/>
+            <wp:extent cx="4392000" cy="4576926"/>
+            <wp:docPr id="8" name="Picture 8"/>
             <wp:cNvGraphicFramePr>
               <a:graphicFrameLocks noChangeAspect="1"/>
             </wp:cNvGraphicFramePr>
@@ -422,11 +537,11 @@
               <a:graphicData uri="http://schemas.openxmlformats.org/drawingml/2006/picture">
                 <pic:pic>
                   <pic:nvPicPr>
-                    <pic:cNvPr id="0" name="15-data-explorer-temperatura.png"/>
+                    <pic:cNvPr id="0" name="05-esp32-wokwi-serial.png"/>
                     <pic:cNvPicPr/>
                   </pic:nvPicPr>
                   <pic:blipFill>
-                    <a:blip r:embed="rId14"/>
+                    <a:blip r:embed="rId16"/>
                     <a:stretch>
                       <a:fillRect/>
                     </a:stretch>
@@ -434,7 +549,7 @@
                   <pic:spPr>
                     <a:xfrm>
                       <a:off x="0" y="0"/>
-                      <a:ext cx="4464000" cy="4252436"/>
+                      <a:ext cx="4392000" cy="4576926"/>
                     </a:xfrm>
                     <a:prstGeom prst="rect"/>
                   </pic:spPr>
@@ -456,7 +571,7 @@
           <w:color w:val="64748B"/>
           <w:sz w:val="15"/>
         </w:rPr>
-        <w:t>Fig. 3 — Data explorer: tendencia de temperatura de la flota (últimas 24 h).</w:t>
+        <w:t>Fig. 4 — Log serial del ESP32 (Wokwi headless): WiFi → NTP → DPS (assignedHub) → IoT Hub → publish {temperature, humedad, illuminance}.</w:t>
       </w:r>
     </w:p>
     <w:p>
@@ -640,7 +755,7 @@
                 <w:b w:val="0"/>
                 <w:sz w:val="16"/>
               </w:rPr>
-              <w:t>~55 B</w:t>
+              <w:t>46 B (medido)</w:t>
             </w:r>
           </w:p>
         </w:tc>
@@ -718,7 +833,7 @@
                 <w:b w:val="0"/>
                 <w:sz w:val="16"/>
               </w:rPr>
-              <w:t>~5 s</w:t>
+              <w:t>5 s → ~10 s (sim)</w:t>
             </w:r>
           </w:p>
         </w:tc>
@@ -1125,7 +1240,7 @@
               <w:drawing>
                 <wp:inline xmlns:a="http://schemas.openxmlformats.org/drawingml/2006/main" xmlns:pic="http://schemas.openxmlformats.org/drawingml/2006/picture">
                   <wp:extent cx="2916000" cy="2665033"/>
-                  <wp:docPr id="7" name="Picture 7"/>
+                  <wp:docPr id="9" name="Picture 9"/>
                   <wp:cNvGraphicFramePr>
                     <a:graphicFrameLocks noChangeAspect="1"/>
                   </wp:cNvGraphicFramePr>
@@ -1137,7 +1252,7 @@
                           <pic:cNvPicPr/>
                         </pic:nvPicPr>
                         <pic:blipFill>
-                          <a:blip r:embed="rId15"/>
+                          <a:blip r:embed="rId17"/>
                           <a:stretch>
                             <a:fillRect/>
                           </a:stretch>
@@ -1169,7 +1284,7 @@
               <w:drawing>
                 <wp:inline xmlns:a="http://schemas.openxmlformats.org/drawingml/2006/main" xmlns:pic="http://schemas.openxmlformats.org/drawingml/2006/picture">
                   <wp:extent cx="3311999" cy="1827310"/>
-                  <wp:docPr id="8" name="Picture 8"/>
+                  <wp:docPr id="10" name="Picture 10"/>
                   <wp:cNvGraphicFramePr>
                     <a:graphicFrameLocks noChangeAspect="1"/>
                   </wp:cNvGraphicFramePr>
@@ -1181,7 +1296,7 @@
                           <pic:cNvPicPr/>
                         </pic:nvPicPr>
                         <pic:blipFill>
-                          <a:blip r:embed="rId16"/>
+                          <a:blip r:embed="rId18"/>
                           <a:stretch>
                             <a:fillRect/>
                           </a:stretch>
@@ -1214,7 +1329,7 @@
           <w:color w:val="64748B"/>
           <w:sz w:val="15"/>
         </w:rPr>
-        <w:t>Fig. 4 — (izq.) corte de red 16 s: DESCONECTADO (rc=7), encolado y reconexión automática con flush sin pérdida (ACK de 15.4 s→0.5 s).  (der.) QoS 2: el Hub responde PUBACK en vez de PUBREC (degrada a QoS 1).</w:t>
+        <w:t>Fig. 5 — (izq.) corte de red 16 s: DESCONECTADO (rc=7), encolado y reconexión automática con flush sin pérdida (ACK de 15.4 s→0.5 s).  (der.) QoS 2: el Hub responde PUBACK en vez de PUBREC (degrada a QoS 1).</w:t>
       </w:r>
     </w:p>
     <w:p>
@@ -1865,7 +1980,7 @@
           <w:color w:val="1E293B"/>
           <w:sz w:val="18"/>
         </w:rPr>
-        <w:t>Contenido: mqtt/mqtt_explicito.py (cliente MQTT explícito con paho: DPS + SAS + publish + QoS) y mqtt-explicito.service · sdk/IoTCentralSender.py (dispositivo SDK del Lab 2, línea base) · wokwi/ (proyecto ESP32, firmware MQTT explícito, sin cambios respecto al Lab 2) · README.md (explica cómo se genera el token SAS, sin secretos en claro) · mediciones/ (logs y CSV reales) · evidencias/ (logs de connect/publish renderizados y 6 capturas de IoT Central) · este informe en PDF. Las credenciales nunca se suben: van en variables de entorno (.env, ignorado por git).</w:t>
+        <w:t>Contenido: mqtt/mqtt_explicito.py (cliente MQTT explícito con paho: DPS + SAS + publish + QoS) y mqtt-explicito.service · sdk/IoTCentralSender.py (dispositivo SDK del Lab 2, línea base) · wokwi/ (proyecto ESP32, firmware MQTT explícito, re-simulado en vivo con wokwi-cli; campo humedad alineado a la plantilla) · README.md (explica cómo se genera el token SAS, sin secretos en claro) · mediciones/ (logs y CSV reales, incl. serial del ESP32) · evidencias/ (logs renderizados + 8 capturas de IoT Central: device Conectado, flota, JSON, SDK, Data explorer y ESP32) · este informe en PDF. Las credenciales nunca se suben: van en variables de entorno (.env, ignorado por git).</w:t>
       </w:r>
     </w:p>
     <w:sectPr>

</xml_diff>